<commit_message>
Add published notebook journey evidence
</commit_message>
<xml_diff>
--- a/prototype/eligibility-workspace/qa/evidence/notebook-approved-journey/Help-Eligibility-Workers-Explain-Verify-And-Document-job-aid.docx
+++ b/prototype/eligibility-workspace/qa/evidence/notebook-approved-journey/Help-Eligibility-Workers-Explain-Verify-And-Document-job-aid.docx
@@ -65,7 +65,7 @@
         <w:spacing w:after="140"/>
       </w:pPr>
       <w:r>
-        <w:t xml:space="preserve">When electronic data is incomplete, request acceptable proof and explain the available options in plain language.</w:t>
+        <w:t xml:space="preserve">When electronic data is incomplete, eligibility workers should request acceptable proof and explain available options clearly.</w:t>
       </w:r>
     </w:p>
     <w:p>
@@ -81,7 +81,7 @@
         <w:spacing w:after="140"/>
       </w:pPr>
       <w:r>
-        <w:t xml:space="preserve">Program-specific reporting requirements must remain explicit and should not be combined into a universal rule.</w:t>
+        <w:t xml:space="preserve">Program-specific reporting requirements must be explicit, without combining different deadlines into a universal rule.</w:t>
       </w:r>
     </w:p>
     <w:p>
@@ -97,7 +97,23 @@
         <w:spacing w:after="140"/>
       </w:pPr>
       <w:r>
-        <w:t xml:space="preserve">Workers should confirm the reported change, identify the affected program, request required evidence, document the action, and inform the household of the next step.</w:t>
+        <w:t xml:space="preserve">Eligibility workers need to confirm reported changes, identify the affected program, request necessary evidence, document the action taken, and inform the household of the next steps.</w:t>
+      </w:r>
+    </w:p>
+    <w:p>
+      <w:pPr>
+        <w:pStyle w:val="Heading1"/>
+      </w:pPr>
+      <w:r>
+        <w:t xml:space="preserve">Worker checklist</w:t>
+      </w:r>
+    </w:p>
+    <w:p>
+      <w:pPr>
+        <w:spacing w:after="140"/>
+      </w:pPr>
+      <w:r>
+        <w:t xml:space="preserve">Eligibility workers must thoroughly document all aspects of a reported change to ensure compliance and accurate record-keeping.</w:t>
       </w:r>
     </w:p>
     <w:p>
@@ -138,6 +154,38 @@
       </w:pPr>
       <w:r>
         <w:t xml:space="preserve">Worker checklist</w:t>
+      </w:r>
+    </w:p>
+    <w:p>
+      <w:pPr>
+        <w:spacing w:after="140"/>
+      </w:pPr>
+      <w:r>
+        <w:t xml:space="preserve">Household change reporting</w:t>
+      </w:r>
+    </w:p>
+    <w:p>
+      <w:pPr>
+        <w:spacing w:after="140"/>
+      </w:pPr>
+      <w:r>
+        <w:t xml:space="preserve">Worker checklist</w:t>
+      </w:r>
+    </w:p>
+    <w:p>
+      <w:pPr>
+        <w:pStyle w:val="Heading1"/>
+      </w:pPr>
+      <w:r>
+        <w:t xml:space="preserve">New section</w:t>
+      </w:r>
+    </w:p>
+    <w:p>
+      <w:pPr>
+        <w:spacing w:after="140"/>
+      </w:pPr>
+      <w:r>
+        <w:t xml:space="preserve">Add grounded content here.</w:t>
       </w:r>
     </w:p>
     <w:p>

</xml_diff>